<commit_message>
v13.4: Fa10-Befund im Kurzbericht, Backlog nachgezogen
Der Statik-Check hat beim ersten Lauf eine curriculare Lücke gefunden, die
nachgeprüft wurde: Alle sieben Module, die Fa10 Selbstmanagement aufbauen, sind
[B] oder [B/C] — keines hat einen KI-freien Prüfungsanteil, obwohl Fa10 im
Interaktiven Proseminar und im Praktikum als Hauptkompetenz geführt wird.

Im Kurzbericht als offene fachliche Frage formuliert, nicht als Mangel behauptet:
Entweder gilt Selbstmanagement als Kernfertigkeit und braucht einen KI-freien
Nachweis, oder es ist prozessbezogen und die Zuordnung zu den Fachkompetenzen
gehört überdacht. Der Punkt ist, dass die Frage bisher nicht sichtbar war.

Co-Authored-By: Claude Opus 5 <noreply@anthropic.com>
</commit_message>
<xml_diff>
--- a/40_Programmleitung/Kurzbericht_Kompetenzhaus_v12.docx
+++ b/40_Programmleitung/Kurzbericht_Kompetenzhaus_v12.docx
@@ -1738,6 +1738,124 @@
           <w:color w:val="161A26"/>
         </w:rPr>
         <w:t xml:space="preserve"> Sicherheitshinweis mit 143, 147, 144 und der Beratungsstelle der UZH — nicht zu einer generierten Antwort.</w:t>
+      </w:r>
+    </w:p>
+    <w:p>
+      <w:pPr>
+        <w:spacing w:after="331"/>
+      </w:pPr>
+      <w:r>
+        <w:rPr>
+          <w:rFonts w:ascii="Helvetica Neue" w:hAnsi="Helvetica Neue" w:cs="Helvetica Neue"/>
+          <w:sz w:val="40"/>
+          <w:sz-cs w:val="40"/>
+          <w:b/>
+          <w:spacing w:val="0"/>
+          <w:color w:val="001394"/>
+        </w:rPr>
+        <w:t xml:space="preserve">Ein Befund aus dem neuen Statik-Check</w:t>
+      </w:r>
+    </w:p>
+    <w:p>
+      <w:pPr>
+        <w:spacing w:after="293"/>
+      </w:pPr>
+      <w:r>
+        <w:rPr>
+          <w:rFonts w:ascii="Helvetica Neue" w:hAnsi="Helvetica Neue" w:cs="Helvetica Neue"/>
+          <w:sz w:val="29"/>
+          <w:sz-cs w:val="29"/>
+          <w:spacing w:val="0"/>
+          <w:color w:val="161A26"/>
+        </w:rPr>
+        <w:t xml:space="preserve">Das Spiel enthält neu einen Statik-Check, der die Prüfungslogik des gebauten Hauses gegen die Two-Lane-Regel hält: Ist jede Fachkompetenz mindestens einmal </w:t>
+      </w:r>
+      <w:r>
+        <w:rPr>
+          <w:rFonts w:ascii="Helvetica Neue" w:hAnsi="Helvetica Neue" w:cs="Helvetica Neue"/>
+          <w:sz w:val="29"/>
+          <w:sz-cs w:val="29"/>
+          <w:b/>
+          <w:spacing w:val="0"/>
+          <w:color w:val="161A26"/>
+        </w:rPr>
+        <w:t xml:space="preserve">KI-frei</w:t>
+      </w:r>
+      <w:r>
+        <w:rPr>
+          <w:rFonts w:ascii="Helvetica Neue" w:hAnsi="Helvetica Neue" w:cs="Helvetica Neue"/>
+          <w:sz w:val="29"/>
+          <w:sz-cs w:val="29"/>
+          <w:spacing w:val="0"/>
+          <w:color w:val="161A26"/>
+        </w:rPr>
+        <w:t xml:space="preserve"> nachgewiesen, und wird jede KI-Kompetenz mindestens einmal dort geprüft, wo KI tatsächlich vorkommt?</w:t>
+      </w:r>
+    </w:p>
+    <w:p>
+      <w:pPr>
+        <w:spacing w:after="293"/>
+      </w:pPr>
+      <w:r>
+        <w:rPr>
+          <w:rFonts w:ascii="Helvetica Neue" w:hAnsi="Helvetica Neue" w:cs="Helvetica Neue"/>
+          <w:sz w:val="29"/>
+          <w:sz-cs w:val="29"/>
+          <w:spacing w:val="0"/>
+          <w:color w:val="161A26"/>
+        </w:rPr>
+        <w:t xml:space="preserve">Beim ersten Lauf über das vollständig gebaute Haus bleibt genau eine Lücke, und sie ist curricular, nicht technisch: </w:t>
+      </w:r>
+      <w:r>
+        <w:rPr>
+          <w:rFonts w:ascii="Helvetica Neue" w:hAnsi="Helvetica Neue" w:cs="Helvetica Neue"/>
+          <w:sz w:val="29"/>
+          <w:sz-cs w:val="29"/>
+          <w:b/>
+          <w:spacing w:val="0"/>
+          <w:color w:val="161A26"/>
+        </w:rPr>
+        <w:t xml:space="preserve">Fa10 Selbstmanagement wird von sieben Modulen aufgebaut — und keines davon hat einen KI-freien Prüfungsanteil.</w:t>
+      </w:r>
+      <w:r>
+        <w:rPr>
+          <w:rFonts w:ascii="Helvetica Neue" w:hAnsi="Helvetica Neue" w:cs="Helvetica Neue"/>
+          <w:sz w:val="29"/>
+          <w:sz-cs w:val="29"/>
+          <w:spacing w:val="0"/>
+          <w:color w:val="161A26"/>
+        </w:rPr>
+        <w:t xml:space="preserve"> Alle sieben sind [B] oder [B/C]; im Interaktiven Proseminar und im Praktikum ist Selbstmanagement sogar als Hauptkompetenz geführt.</w:t>
+      </w:r>
+    </w:p>
+    <w:p>
+      <w:pPr>
+        <w:spacing w:after="293"/>
+      </w:pPr>
+      <w:r>
+        <w:rPr>
+          <w:rFonts w:ascii="Helvetica Neue" w:hAnsi="Helvetica Neue" w:cs="Helvetica Neue"/>
+          <w:sz w:val="29"/>
+          <w:sz-cs w:val="29"/>
+          <w:spacing w:val="0"/>
+          <w:color w:val="161A26"/>
+        </w:rPr>
+        <w:t xml:space="preserve">Ob das ein Mangel ist, ist eine fachliche Frage an die Programmleitung. Zwei Lesarten sind vertretbar: Entweder gilt Selbstmanagement als Kernfertigkeit, die auch ohne Werkzeug belegt sein sollte — dann fehlt ein KI-freier Nachweis. Oder es gilt als prozessbezogene Kompetenz, die sich ohnehin nur im begleiteten Tun zeigt — dann greift die Two-Lane-Regel hier anders als bei Methoden- oder Diagnostikkompetenz, und die Zuordnung zu den Fachkompetenzen wäre zu überdenken.</w:t>
+      </w:r>
+    </w:p>
+    <w:p>
+      <w:pPr>
+        <w:spacing w:after="293"/>
+      </w:pPr>
+      <w:r>
+        <w:rPr>
+          <w:rFonts w:ascii="Helvetica Neue" w:hAnsi="Helvetica Neue" w:cs="Helvetica Neue"/>
+          <w:sz w:val="29"/>
+          <w:sz-cs w:val="29"/>
+          <w:spacing w:val="0"/>
+          <w:color w:val="161A26"/>
+        </w:rPr>
+        <w:t xml:space="preserve">Der Punkt für die Programmarbeit ist nicht die Antwort, sondern dass die Frage bisher nicht sichtbar war.</w:t>
       </w:r>
     </w:p>
     <w:p>

</xml_diff>